<commit_message>
Update project overview and README
</commit_message>
<xml_diff>
--- a/HealthyCity_NGO_Project_Overview.docx
+++ b/HealthyCity_NGO_Project_Overview.docx
@@ -70,7 +70,23 @@
           <w:sz w:val="22"/>
           <w:szCs w:val="22"/>
         </w:rPr>
-        <w:t>This project analyzes public health data in Python to identify patient characteristics associated with hospitalization for seasonal respiratory illness. The analysis focused on understanding the patient population, exploring hospitalization patterns across key health and behavioral variables, and examining which factors may be linked to higher hospitalization risk.</w:t>
+        <w:t>This project analyzes public health data in Python to identify patient characteristics associated with hospitalization for seasonal respiratory illness. The analysis focused on understanding the patient population, exploring hospitalization patterns across key health and behavio</w:t>
+      </w:r>
+      <w:r>
+        <w:rPr>
+          <w:rFonts w:ascii="Calibri" w:hAnsi="Calibri" w:cs="Calibri"/>
+          <w:sz w:val="22"/>
+          <w:szCs w:val="22"/>
+        </w:rPr>
+        <w:t>u</w:t>
+      </w:r>
+      <w:r>
+        <w:rPr>
+          <w:rFonts w:ascii="Calibri" w:hAnsi="Calibri" w:cs="Calibri"/>
+          <w:sz w:val="22"/>
+          <w:szCs w:val="22"/>
+        </w:rPr>
+        <w:t>ral variables, and examining which factors may be linked to higher hospitalization risk.</w:t>
       </w:r>
     </w:p>
     <w:p>
@@ -1019,7 +1035,23 @@
           <w:sz w:val="22"/>
           <w:szCs w:val="22"/>
         </w:rPr>
-        <w:t>Strengthen preventive outreach and follow-up for patients with higher-risk behavioral and clinical profiles, including smokers and patients with elevated severity levels</w:t>
+        <w:t>Strengthen preventive outreach and follow-up for patients with higher-risk behavio</w:t>
+      </w:r>
+      <w:r>
+        <w:rPr>
+          <w:rFonts w:ascii="Calibri" w:hAnsi="Calibri" w:cs="Calibri"/>
+          <w:sz w:val="22"/>
+          <w:szCs w:val="22"/>
+        </w:rPr>
+        <w:t>u</w:t>
+      </w:r>
+      <w:r>
+        <w:rPr>
+          <w:rFonts w:ascii="Calibri" w:hAnsi="Calibri" w:cs="Calibri"/>
+          <w:sz w:val="22"/>
+          <w:szCs w:val="22"/>
+        </w:rPr>
+        <w:t>ral and clinical profiles, including smokers and patients with elevated severity levels</w:t>
       </w:r>
     </w:p>
     <w:p>

</xml_diff>